<commit_message>
Cahier des exigences aligné sur Séance 5.2
- Chapitre « Version 5 » : ce qui est livré de la 4.7 à la 5.2, version par version.
- EF-176 à EF-180 : les pouces, le lecteur vidéo intégré, « Annuler » partout, les suggestions sur Ce soir,
  l'essai d'alerte. EF-69 (résumé hebdomadaire) est livrée sous la forme de l'e-mail de la semaine.
- État de la version 4 : documentaires et favoris passent à « livrées » ; restent EF-161 et le fichier d'EF-167.
- Jalons, historique des versions et points ouverts remis à jour.

Co-Authored-By: Claude Opus 5 <noreply@anthropic.com>
</commit_message>
<xml_diff>
--- a/Documentation/Séance — cahier des exigences.docx
+++ b/Documentation/Séance — cahier des exigences.docx
@@ -13,7 +13,7 @@
     <w:p>
       <w:pPr/>
       <w:r>
-        <w:t xml:space="preserve">20 septembre 2026 · Patrick · cahier aligné sur Séance 4.6, iPhone, iPad, Mac et Apple TV</w:t>
+        <w:t xml:space="preserve">21 septembre 2026 · Patrick · cahier aligné sur Séance 5.2, iPhone, iPad, Mac et Apple TV</w:t>
       </w:r>
     </w:p>
     <w:p>
@@ -21,19 +21,19 @@
         <w:pStyle w:val="Heading2"/>
       </w:pPr>
       <w:r>
-        <w:t xml:space="preserve">Où en est l'app : Séance 4.6</w:t>
+        <w:t xml:space="preserve">Où en est l'app : Séance 5.2</w:t>
       </w:r>
     </w:p>
     <w:p>
       <w:pPr/>
       <w:r>
-        <w:t xml:space="preserve">Ce cahier a été écrit le 16 septembre 2026, avant le développement. Il est ici aligné sur la version 4.6 du 20 septembre 2026, installée sur l'iPhone 17 Pro, l'iPad, le Mac et l'Apple TV. Les exigences de la V1 gardent leur numéro et leur texte ; ce qui a changé depuis est décrit dans quatre ajouts : les exigences EF-88 à EF-140, le tableau « État des exigences de la V1 en version 3.2 », le chapitre « Version 4 » avec l'état de chacune de ses exigences, et l'historique des versions à la fin des jalons.</w:t>
+        <w:t xml:space="preserve">Ce cahier a été écrit le 16 septembre 2026, avant le développement. Il est ici aligné sur la version 5.2 du 21 septembre 2026, installée sur l'iPhone 17 Pro, l'iPad et l'Apple TV (le Mac suit dès que l'app y est fermée). Les exigences de la V1 gardent leur numéro et leur texte ; ce qui a changé depuis est décrit dans quatre ajouts : les exigences EF-88 à EF-140, le tableau « État des exigences de la V1 en version 3.2 », les chapitres « Version 4 » et « Version 5 » avec l'état de chacune de leurs exigences, et l'historique des versions à la fin des jalons.</w:t>
       </w:r>
     </w:p>
     <w:p>
       <w:pPr/>
       <w:r>
-        <w:t xml:space="preserve">En deux phrases : l'app couvre les douze fonctions prévues, sauf les alertes par email, abandonnées ; les listes nommées sont arrivées en version 2.4. Elle a gagné une version Mac, un profil séparé des réglages, le suivi des acteurs, « Déjà vu avant », la note des titres, des soirées prévues à la date de son choix et des idées du soir classées selon les goûts ; puis, de la 2.4 à la 3.1, un programme télé et une page Ce soir en grandes cartes, la synchronisation entre appareils par un dossier d'iCloud Drive, une apparence claire, et un fonctionnement sans réseau. Le 20 septembre 2026, les versions 4.0 à 4.6 ont ajouté un quatrième appareil, l'Apple TV, avec son interface propre ; « où regarder » est devenu un bouton qui ouvre la plateforme, lance la vidéo du NAS ou donne la chaîne et l'heure ; s'y ajoutent les vidéos personnelles du NAS, « Je n'aime pas », des Réglages redessinés, la mise en route d'un appareil par un code à six chiffres, et la synchronisation par un dossier du NAS, qui apporte enfin ses listes à l'Apple TV.</w:t>
+        <w:t xml:space="preserve">En deux phrases : l'app couvre les douze fonctions prévues, sauf les alertes par email, abandonnées ; les listes nommées sont arrivées en version 2.4. Elle a gagné une version Mac, un profil séparé des réglages, le suivi des acteurs, « Déjà vu avant », la note des titres, des soirées prévues à la date de son choix et des idées du soir classées selon les goûts ; puis, de la 2.4 à la 3.1, un programme télé et une page Ce soir en grandes cartes, la synchronisation entre appareils par un dossier d'iCloud Drive, une apparence claire, et un fonctionnement sans réseau. Le 20 septembre 2026, les versions 4.0 à 4.6 ont ajouté un quatrième appareil, l'Apple TV, avec son interface propre ; « où regarder » est devenu un bouton qui ouvre la plateforme, lance la vidéo du NAS ou donne la chaîne et l'heure ; s'y ajoutent les vidéos personnelles du NAS, « Je n'aime pas », des Réglages redessinés, la mise en route d'un appareil par un code à six chiffres, et la synchronisation par un dossier du NAS, qui apporte enfin ses listes à l'Apple TV. Le 21 septembre, les versions 4.7 à 5.2 ont ajouté les pouces 👍 👎, l'e-mail de la semaine, les documentaires, les favoris à partager, la lecture des vidéos de famille dans l'app, et une Apple TV aussi complète que l'iPhone.</w:t>
       </w:r>
     </w:p>
     <w:p>
@@ -3062,7 +3062,7 @@
     <w:p>
       <w:pPr/>
       <w:r>
-        <w:t xml:space="preserve">Le cahier compte 175 exigences, numérotées pour pouvoir les citer dans le code et les tests : EF-01 à EF-87 pour la V1, puis EF-88 à EF-140 ajoutées des versions 1.2 à 3.2, EF-141 à EF-164 pour la version 4, EF-165 à EF-169 pour les suivantes, et EF-170 à EF-175 nées en cours de route et livrées dans les versions 4.1 à 4.6 (chapitre « Version 4 »). Les exigences de la V1 gardent leur texte d'origine ; le tableau « État des exigences de la V1 en version 3.2 » dit lesquelles ont changé, et lesquelles ont été abandonnées. Les durées et seuils indiqués sont des valeurs par défaut, réglables.</w:t>
+        <w:t xml:space="preserve">Le cahier compte 180 exigences, numérotées pour pouvoir les citer dans le code et les tests : EF-01 à EF-87 pour la V1, puis EF-88 à EF-140 ajoutées des versions 1.2 à 3.2, EF-141 à EF-164 pour la version 4, EF-165 à EF-169 pour les suivantes, EF-170 à EF-175 nées pendant la version 4, et EF-176 à EF-180 pendant la version 5 (chapitres « Version 4 » et « Version 5 »). Les exigences de la V1 gardent leur texte d'origine ; le tableau « État des exigences de la V1 en version 3.2 » dit lesquelles ont changé, et lesquelles ont été abandonnées. Les durées et seuils indiqués sont des valeurs par défaut, réglables.</w:t>
       </w:r>
     </w:p>
     <w:p>
@@ -6969,7 +6969,7 @@
     <w:p>
       <w:pPr/>
       <w:r>
-        <w:t xml:space="preserve">Demandée par Patrick le 20 septembre 2026, et livrée le jour même en sept versions, de la 4.0 à la 4.6, installées sur l'iPhone, l'iPad, le Mac et l'Apple TV. Séance existe maintenant sur la télévision, « où regarder » est devenu un bouton, les vidéos personnelles du NAS ont leur page, et la synchronisation passe aussi par un dossier du NAS, qui apporte ses listes à la TV. Restent à faire dans ce chapitre : les documentaires (EF-151 à EF-156) et l'envoi d'une vidéo vers le NAS (EF-161). Les exigences gardent leur texte d'origine ; ce qui a été fait, fait autrement, ou reste à faire est dit dans « État des exigences de la version 4 ».</w:t>
+        <w:t xml:space="preserve">Demandée par Patrick le 20 septembre 2026, et livrée le jour même en sept versions, de la 4.0 à la 4.6, installées sur l'iPhone, l'iPad, le Mac et l'Apple TV. Séance existe maintenant sur la télévision, « où regarder » est devenu un bouton, les vidéos personnelles du NAS ont leur page, et la synchronisation passe aussi par un dossier du NAS, qui apporte ses listes à la TV. Les documentaires (EF-151 à EF-156) et les favoris (EF-165 à EF-168) ont suivi en version 5.2 ; il ne reste de ce chapitre que l'envoi d'une vidéo vers le NAS (EF-161). Les exigences gardent leur texte d'origine ; ce qui a été fait, fait autrement, ou reste à faire est dit dans « État des exigences de la version 4 ».</w:t>
       </w:r>
     </w:p>
     <w:p>
@@ -7311,7 +7311,7 @@
         <w:t xml:space="preserve">EF-151 à EF-156</w:t>
       </w:r>
       <w:r>
-        <w:t xml:space="preserve"> À faire : les documentaires restent écartés de la découverte (genre 99), et le guide télé ne retient que les films et les séries.</w:t>
+        <w:t xml:space="preserve"> Livrées en 5.2, pour l'essentiel : page Documentaires et étagère d'accueil, dix thèmes cochables, chacun un jeu de mots-clés TMDB cherchés une fois puis gardés. Restent hors du lot : les documentaires du guide télé (le guide ne retient que films et séries) et ceux du NAS, ainsi que les alertes qui leur seraient propres.</w:t>
       </w:r>
     </w:p>
     <w:p>
@@ -7365,7 +7365,7 @@
         <w:t xml:space="preserve">EF-164</w:t>
       </w:r>
       <w:r>
-        <w:t xml:space="preserve"> Reporté : le modèle de données a bien changé de version pendant la version 4, mais pour les champs de ces lots-là ; le schéma des documentaires viendra avec leur lot.</w:t>
+        <w:t xml:space="preserve"> Sans objet : les documentaires n'ont pas demandé de champ nouveau (ils se lisent chez TMDB). Le modèle est passé en version 3 pour les « J'aime » (4.7) puis en version 4 pour les favoris (5.2), chaque fois par migration légère, avec son test.</w:t>
       </w:r>
     </w:p>
     <w:p>
@@ -7383,7 +7383,7 @@
         <w:t xml:space="preserve">EF-165 à EF-168</w:t>
       </w:r>
       <w:r>
-        <w:t xml:space="preserve"> À faire : les favoris.</w:t>
+        <w:t xml:space="preserve"> Livrées en 5.2 : un modèle à part (schéma version 4), l'onglet Favoris de Mes listes, l'entrée dans la fiche et dans l'appui long, le partage de la liste par Messages, Mail ou AirDrop, et le voyage dans la sauvegarde et la synchronisation. Le fichier « .seance » d'EF-167, qui deviendrait une liste nommée chez le destinataire, reste à faire.</w:t>
       </w:r>
     </w:p>
     <w:p>
@@ -8232,6 +8232,278 @@
       </w:r>
       <w:r>
         <w:t xml:space="preserve">  Un abonnement Claude (claude.ai) ne donne pas à une app tierce le droit d'appeler Claude : Anthropic ne propose pas de connexion « avec son compte Claude » pour les apps des autres, et l'abonnement ne couvre pas l'API. La seule voie est celle que Séance a déjà : une clé d'API, facturée à l'usage, saisie dans Réglages › Claude (EF-86). À revoir si Anthropic ouvre un jour une telle connexion.</w:t>
+      </w:r>
+    </w:p>
+    <w:p>
+      <w:pPr>
+        <w:pStyle w:val="Heading2"/>
+      </w:pPr>
+      <w:r>
+        <w:t xml:space="preserve">Version 5 : pouces, e-mail de la semaine, documentaires et favoris</w:t>
+      </w:r>
+    </w:p>
+    <w:p>
+      <w:pPr/>
+      <w:r>
+        <w:t xml:space="preserve">Livrée le 21 septembre 2026, en cinq versions (4.7, 5.0, 5.1, 5.2), sur l'iPhone, l'iPad, le Mac et l'Apple TV. Elle finit ce que la version 4 avait laissé — documentaires, favoris —, ajoute les pouces et l'e-mail de la semaine, et répond aux idées demandées par Patrick le 21 septembre : lecture des vidéos de famille dans l'app, « Annuler » partout, et une application qui s'ouvre et défile plus vite.</w:t>
+      </w:r>
+    </w:p>
+    <w:p>
+      <w:pPr>
+        <w:pStyle w:val="Heading3"/>
+      </w:pPr>
+      <w:r>
+        <w:t xml:space="preserve">Ce qui est livré, version par version</w:t>
+      </w:r>
+    </w:p>
+    <w:p>
+      <w:pPr>
+        <w:pStyle w:val="ListParagraph"/>
+        <w:numPr>
+          <w:ilvl w:val="0"/>
+          <w:numId w:val="2"/>
+        </w:numPr>
+      </w:pPr>
+      <w:r>
+        <w:rPr>
+          <w:b/>
+        </w:rPr>
+        <w:t xml:space="preserve">4.7 — Les pouces.</w:t>
+      </w:r>
+      <w:r>
+        <w:t xml:space="preserve">  👍 « J'aime » sur une fiche, une idée ou une affiche, sans avoir vu le titre ; 👎 « Je n'aime pas » sorti du menu « Plus » ; les deux listés dans Réglages › Prénom et idées (EF-176).</w:t>
+      </w:r>
+    </w:p>
+    <w:p>
+      <w:pPr>
+        <w:pStyle w:val="ListParagraph"/>
+        <w:numPr>
+          <w:ilvl w:val="0"/>
+          <w:numId w:val="2"/>
+        </w:numPr>
+      </w:pPr>
+      <w:r>
+        <w:rPr>
+          <w:b/>
+        </w:rPr>
+        <w:t xml:space="preserve">5.0 — L'e-mail de la semaine, et des Réglages en cartes.</w:t>
+      </w:r>
+      <w:r>
+        <w:t xml:space="preserve">  Un résumé hebdomadaire envoyé par courriel, au jour et à l'heure choisis (EF-69, enfin livrée) ; des suggestions sur la page Ce soir (EF-179) ; les Réglages et le Mac redessinés ; « Profil » devient « Préférences ».</w:t>
+      </w:r>
+    </w:p>
+    <w:p>
+      <w:pPr>
+        <w:pStyle w:val="ListParagraph"/>
+        <w:numPr>
+          <w:ilvl w:val="0"/>
+          <w:numId w:val="2"/>
+        </w:numPr>
+      </w:pPr>
+      <w:r>
+        <w:rPr>
+          <w:b/>
+        </w:rPr>
+        <w:t xml:space="preserve">5.1 — L'accueil en grandes cartes.</w:t>
+      </w:r>
+      <w:r>
+        <w:t xml:space="preserve">  Toutes les étagères au format 16/9 de « Ce soir à la TV » ; « Aujourd'hui » en quelques lignes ; « À venir » un jour à la fois ; l'essai d'alerte pensé pour l'Apple Watch (EF-180).</w:t>
+      </w:r>
+    </w:p>
+    <w:p>
+      <w:pPr>
+        <w:pStyle w:val="ListParagraph"/>
+        <w:numPr>
+          <w:ilvl w:val="0"/>
+          <w:numId w:val="2"/>
+        </w:numPr>
+      </w:pPr>
+      <w:r>
+        <w:rPr>
+          <w:b/>
+        </w:rPr>
+        <w:t xml:space="preserve">5.2 — Documentaires, favoris, lecteur intégré, et la vitesse.</w:t>
+      </w:r>
+      <w:r>
+        <w:t xml:space="preserve">  Les documentaires (EF-151 à EF-156) et les favoris (EF-165 à EF-168) ; la lecture des vidéos de famille dans Séance (EF-177) ; « Annuler » sur tous les gestes qu'on regrette (EF-178) ; « À venir » sur l'Apple TV ; et un lot de performances — index du magasin, requêtes bornées, images préchargées, idées gardées d'un lancement à l'autre, une seule connexion SMB par passage de synchronisation.</w:t>
+      </w:r>
+    </w:p>
+    <w:p>
+      <w:pPr>
+        <w:pStyle w:val="Heading3"/>
+      </w:pPr>
+      <w:r>
+        <w:t xml:space="preserve">Exigences nées pendant la version 5</w:t>
+      </w:r>
+    </w:p>
+    <w:p>
+      <w:pPr>
+        <w:pStyle w:val="ListParagraph"/>
+        <w:numPr>
+          <w:ilvl w:val="0"/>
+          <w:numId w:val="7"/>
+        </w:numPr>
+      </w:pPr>
+      <w:r>
+        <w:rPr>
+          <w:b/>
+        </w:rPr>
+        <w:t xml:space="preserve">EF-176</w:t>
+      </w:r>
+      <w:r>
+        <w:t xml:space="preserve"> Les pouces, sans avoir vu le titre. 👍 dit qu'un titre plaît — il oriente les idées du soir sans entrer dans les listes ni dans les statistiques ; 👎 l'écarte pour de bon (EF-175). Les deux se posent depuis une fiche, une idée ou un appui long sur une affiche, se retirent un par un dans Réglages › Prénom et idées, et voyagent dans la sauvegarde et la synchronisation.</w:t>
+      </w:r>
+    </w:p>
+    <w:p>
+      <w:pPr>
+        <w:pStyle w:val="ListParagraph"/>
+        <w:numPr>
+          <w:ilvl w:val="0"/>
+          <w:numId w:val="7"/>
+        </w:numPr>
+      </w:pPr>
+      <w:r>
+        <w:rPr>
+          <w:b/>
+        </w:rPr>
+        <w:t xml:space="preserve">EF-177</w:t>
+      </w:r>
+      <w:r>
+        <w:t xml:space="preserve"> Lire une vidéo personnelle dans Séance. La vidéo reste sur le NAS et se lit dans l'app, par plages d'octets relayées en local : aucune app tierce à convaincre, rien de copié sur l'appareil. Formats lus : MP4, MOV, M4V ; un autre format renvoie vers VLC. Le réglage « Lire dans Séance » permet de revenir aux lecteurs extérieurs.</w:t>
+      </w:r>
+    </w:p>
+    <w:p>
+      <w:pPr>
+        <w:pStyle w:val="ListParagraph"/>
+        <w:numPr>
+          <w:ilvl w:val="0"/>
+          <w:numId w:val="7"/>
+        </w:numPr>
+      </w:pPr>
+      <w:r>
+        <w:rPr>
+          <w:b/>
+        </w:rPr>
+        <w:t xml:space="preserve">EF-178</w:t>
+      </w:r>
+      <w:r>
+        <w:t xml:space="preserve"> Annuler ce qu'on vient de faire. Tout geste qui range, marque ou écarte un titre — « À voir », « Marqué vu », « Ajouté à ma soirée », « Regardé », les pouces, les favoris, le retrait d'une liste — affiche son message avec « Annuler » pendant cinq secondes, et le retour en arrière remet exactement l'état d'avant.</w:t>
+      </w:r>
+    </w:p>
+    <w:p>
+      <w:pPr>
+        <w:pStyle w:val="ListParagraph"/>
+        <w:numPr>
+          <w:ilvl w:val="0"/>
+          <w:numId w:val="7"/>
+        </w:numPr>
+      </w:pPr>
+      <w:r>
+        <w:rPr>
+          <w:b/>
+        </w:rPr>
+        <w:t xml:space="preserve">EF-179</w:t>
+      </w:r>
+      <w:r>
+        <w:t xml:space="preserve"> Des suggestions sur la page Ce soir. À côté de « Surprends-moi », une rangée de titres regardables sur les plateformes cochées, classés d'après les acteurs et les genres aimés. Sur l'Apple TV, la même rangée se trouve sous la soirée.</w:t>
+      </w:r>
+    </w:p>
+    <w:p>
+      <w:pPr>
+        <w:pStyle w:val="ListParagraph"/>
+        <w:numPr>
+          <w:ilvl w:val="0"/>
+          <w:numId w:val="7"/>
+        </w:numPr>
+      </w:pPr>
+      <w:r>
+        <w:rPr>
+          <w:b/>
+        </w:rPr>
+        <w:t xml:space="preserve">EF-180</w:t>
+      </w:r>
+      <w:r>
+        <w:t xml:space="preserve"> Essayer une alerte. Un bouton envoie une notification d'essai. Depuis l'Apple TV, qui n'affiche pas de notification, l'essai passe par le dossier du NAS : l'iPhone le découvre à sa synchronisation suivante et prévient, l'Apple Watch avec lui — ce qui n'arrive que si l'iPhone est verrouillé, comme iOS l'impose.</w:t>
+      </w:r>
+    </w:p>
+    <w:p>
+      <w:pPr>
+        <w:pStyle w:val="Heading3"/>
+      </w:pPr>
+      <w:r>
+        <w:t xml:space="preserve">Ce qui reste, au 21 septembre 2026</w:t>
+      </w:r>
+    </w:p>
+    <w:p>
+      <w:pPr>
+        <w:pStyle w:val="ListParagraph"/>
+        <w:numPr>
+          <w:ilvl w:val="0"/>
+          <w:numId w:val="7"/>
+        </w:numPr>
+      </w:pPr>
+      <w:r>
+        <w:rPr>
+          <w:b/>
+        </w:rPr>
+        <w:t xml:space="preserve">EF-161</w:t>
+      </w:r>
+      <w:r>
+        <w:t xml:space="preserve"> Envoyer une vidéo de l'iPhone, de l'iPad ou du Mac vers le dossier familial du NAS.</w:t>
+      </w:r>
+    </w:p>
+    <w:p>
+      <w:pPr>
+        <w:pStyle w:val="ListParagraph"/>
+        <w:numPr>
+          <w:ilvl w:val="0"/>
+          <w:numId w:val="7"/>
+        </w:numPr>
+      </w:pPr>
+      <w:r>
+        <w:rPr>
+          <w:b/>
+        </w:rPr>
+        <w:t xml:space="preserve">EF-167</w:t>
+      </w:r>
+      <w:r>
+        <w:t xml:space="preserve"> Le fichier « .seance » de favoris, qui devient une liste nommée chez le destinataire ; la liste lisible, elle, se partage déjà.</w:t>
+      </w:r>
+    </w:p>
+    <w:p>
+      <w:pPr>
+        <w:pStyle w:val="ListParagraph"/>
+        <w:numPr>
+          <w:ilvl w:val="0"/>
+          <w:numId w:val="7"/>
+        </w:numPr>
+      </w:pPr>
+      <w:r>
+        <w:rPr>
+          <w:b/>
+        </w:rPr>
+        <w:t xml:space="preserve">EF-151 à EF-156</w:t>
+      </w:r>
+      <w:r>
+        <w:t xml:space="preserve"> Les documentaires du guide télé et ceux du NAS, et leurs alertes propres.</w:t>
+      </w:r>
+    </w:p>
+    <w:p>
+      <w:pPr>
+        <w:pStyle w:val="ListParagraph"/>
+        <w:numPr>
+          <w:ilvl w:val="0"/>
+          <w:numId w:val="7"/>
+        </w:numPr>
+      </w:pPr>
+      <w:r>
+        <w:rPr>
+          <w:b/>
+        </w:rPr>
+        <w:t xml:space="preserve">Essais</w:t>
+      </w:r>
+      <w:r>
+        <w:t xml:space="preserve"> Rien de ce qui touche le vrai NAS ni le vrai réseau n'a pu être vérifié ici : lecture d'une vidéo de famille, synchronisation par le NAS, ouverture de Netflix, Prime Video et Apple TV par leurs boutons, documentaires avec la vraie clé TMDB, partage de la liste de favoris, étagère du haut de l'Apple TV.</w:t>
       </w:r>
     </w:p>
     <w:p>
@@ -11980,10 +12252,10 @@
         <w:rPr>
           <w:b/>
         </w:rPr>
-        <w:t xml:space="preserve">Avancement au 20 septembre 2026</w:t>
-      </w:r>
-      <w:r>
-        <w:t xml:space="preserve"> : les jalons 1 à 6 sont livrés, et la version 4 y a ajouté un appareil, l'Apple TV, avec son interface propre. L'app est en version 4.6 sur l'iPhone 17 Pro, l'iPad, le Mac et l'Apple TV ; le code est dans le dépôt privé github.com/patrickpinard/Seance. 204 tests SeanceKit et 41 tests SeanceDonnees passent, des tests d'interface parcourent l'iPhone et l'iPad sans clé TMDB, et l'app compile sans avertissement en Swift 6 strict. Restent ouverts : le résumé hebdomadaire (EF-69), les documentaires et les favoris, l'envoi d'une vidéo vers le NAS (EF-161), et les essais qui demandent les vrais appareils et le vrai NAS.</w:t>
+        <w:t xml:space="preserve">Avancement au 21 septembre 2026</w:t>
+      </w:r>
+      <w:r>
+        <w:t xml:space="preserve"> : les jalons 1 à 6 sont livrés, et la version 4 y a ajouté un appareil, l'Apple TV, avec son interface propre. L'app est en version 5.2 sur l'iPhone 17 Pro, l'iPad et l'Apple TV ; le code est dans le dépôt privé github.com/patrickpinard/Seance. 215 tests SeanceKit et 43 tests SeanceDonnees passent, des tests d'interface parcourent l'iPhone et l'iPad sans clé TMDB, et l'app compile sans avertissement en Swift 6 strict. Restent ouverts : l'envoi d'une vidéo vers le NAS (EF-161), le fichier de favoris à ouvrir chez un ami (EF-167), les documentaires à la télé et sur le NAS, et les essais qui demandent les vrais appareils et le vrai NAS.</w:t>
       </w:r>
     </w:p>
     <w:p>
@@ -12055,7 +12327,7 @@
           <w:p>
             <w:pPr/>
             <w:r>
-              <w:t xml:space="preserve">4.6</w:t>
+              <w:t xml:space="preserve">5.2</w:t>
             </w:r>
           </w:p>
         </w:tc>
@@ -12066,7 +12338,7 @@
           <w:p>
             <w:pPr/>
             <w:r>
-              <w:t xml:space="preserve">20 septembre 2026</w:t>
+              <w:t xml:space="preserve">21 septembre 2026</w:t>
             </w:r>
           </w:p>
         </w:tc>
@@ -12077,7 +12349,7 @@
           <w:p>
             <w:pPr/>
             <w:r>
-              <w:t xml:space="preserve">Tes listes arrivent sur l'Apple TV, toutes seules : la synchronisation passe aussi par le NAS.</w:t>
+              <w:t xml:space="preserve">Les documentaires arrivent, tes favoris se partagent, tes vidéos de famille se lisent dans l'app — et Séance s'ouvre et défile plus vite.</w:t>
             </w:r>
           </w:p>
         </w:tc>
@@ -12090,7 +12362,7 @@
           <w:p>
             <w:pPr/>
             <w:r>
-              <w:t xml:space="preserve">4.5</w:t>
+              <w:t xml:space="preserve">5.1</w:t>
             </w:r>
           </w:p>
         </w:tc>
@@ -12101,7 +12373,7 @@
           <w:p>
             <w:pPr/>
             <w:r>
-              <w:t xml:space="preserve">20 septembre 2026</w:t>
+              <w:t xml:space="preserve">21 septembre 2026</w:t>
             </w:r>
           </w:p>
         </w:tc>
@@ -12112,7 +12384,7 @@
           <w:p>
             <w:pPr/>
             <w:r>
-              <w:t xml:space="preserve">Ta soirée en quelques touchers : où regarder chaque titre tout de suite, l'épisode 1 d'une série jamais commencée, et « Je n'aime pas ».</w:t>
+              <w:t xml:space="preserve">Un accueil en grandes cartes, « Aujourd'hui » d'un coup d'œil, et un essai d'alerte fait pour l'Apple Watch.</w:t>
             </w:r>
           </w:p>
         </w:tc>
@@ -12125,7 +12397,7 @@
           <w:p>
             <w:pPr/>
             <w:r>
-              <w:t xml:space="preserve">4.4.1</w:t>
+              <w:t xml:space="preserve">5.0</w:t>
             </w:r>
           </w:p>
         </w:tc>
@@ -12136,7 +12408,7 @@
           <w:p>
             <w:pPr/>
             <w:r>
-              <w:t xml:space="preserve">20 septembre 2026</w:t>
+              <w:t xml:space="preserve">21 septembre 2026</w:t>
             </w:r>
           </w:p>
         </w:tc>
@@ -12147,7 +12419,7 @@
           <w:p>
             <w:pPr/>
             <w:r>
-              <w:t xml:space="preserve">Tes vidéos personnelles s'ouvrent dans le lecteur que tu as choisi, Infuse compris.</w:t>
+              <w:t xml:space="preserve">L'e-mail de la semaine, des suggestions sur la page Ce soir, des Réglages en grandes cartes, et « Préférences ».</w:t>
             </w:r>
           </w:p>
         </w:tc>
@@ -12160,7 +12432,7 @@
           <w:p>
             <w:pPr/>
             <w:r>
-              <w:t xml:space="preserve">4.4</w:t>
+              <w:t xml:space="preserve">4.7</w:t>
             </w:r>
           </w:p>
         </w:tc>
@@ -12171,7 +12443,7 @@
           <w:p>
             <w:pPr/>
             <w:r>
-              <w:t xml:space="preserve">20 septembre 2026</w:t>
+              <w:t xml:space="preserve">21 septembre 2026</w:t>
             </w:r>
           </w:p>
         </w:tc>
@@ -12182,7 +12454,7 @@
           <w:p>
             <w:pPr/>
             <w:r>
-              <w:t xml:space="preserve">L'Apple TV refaite : une grande image d'accueil, des réglages enfin lisibles, et les écrans de l'iPhone.</w:t>
+              <w:t xml:space="preserve">👍 👎 comme sur Netflix : dis ce qui te plaît sans l'avoir vu, et les idées du soir te ressemblent davantage.</w:t>
             </w:r>
           </w:p>
         </w:tc>
@@ -12195,7 +12467,7 @@
           <w:p>
             <w:pPr/>
             <w:r>
-              <w:t xml:space="preserve">4.3</w:t>
+              <w:t xml:space="preserve">4.6</w:t>
             </w:r>
           </w:p>
         </w:tc>
@@ -12217,7 +12489,7 @@
           <w:p>
             <w:pPr/>
             <w:r>
-              <w:t xml:space="preserve">Où regarder chaque titre d'un coup d'œil, tes vidéos personnelles sur le NAS, et une app d'un seul style.</w:t>
+              <w:t xml:space="preserve">Tes listes arrivent sur l'Apple TV, toutes seules : la synchronisation passe aussi par le NAS.</w:t>
             </w:r>
           </w:p>
         </w:tc>
@@ -12230,7 +12502,7 @@
           <w:p>
             <w:pPr/>
             <w:r>
-              <w:t xml:space="preserve">4.2</w:t>
+              <w:t xml:space="preserve">4.5</w:t>
             </w:r>
           </w:p>
         </w:tc>
@@ -12252,7 +12524,7 @@
           <w:p>
             <w:pPr/>
             <w:r>
-              <w:t xml:space="preserve">Un nouvel iPad ou un Mac se configure comme l'Apple TV, par un code ; et ta soirée s'affiche sur l'écran d'accueil de la TV.</w:t>
+              <w:t xml:space="preserve">Ta soirée en quelques touchers : où regarder chaque titre tout de suite, l'épisode 1 d'une série jamais commencée, et « Je n'aime pas ».</w:t>
             </w:r>
           </w:p>
         </w:tc>
@@ -12265,7 +12537,7 @@
           <w:p>
             <w:pPr/>
             <w:r>
-              <w:t xml:space="preserve">4.1</w:t>
+              <w:t xml:space="preserve">4.4.1</w:t>
             </w:r>
           </w:p>
         </w:tc>
@@ -12287,7 +12559,7 @@
           <w:p>
             <w:pPr/>
             <w:r>
-              <w:t xml:space="preserve">Des Réglages refaits, un seul lecteur pour « Lire », et une Apple TV presque aussi complète que l'iPhone.</w:t>
+              <w:t xml:space="preserve">Tes vidéos personnelles s'ouvrent dans le lecteur que tu as choisi, Infuse compris.</w:t>
             </w:r>
           </w:p>
         </w:tc>
@@ -12300,7 +12572,7 @@
           <w:p>
             <w:pPr/>
             <w:r>
-              <w:t xml:space="preserve">4.0</w:t>
+              <w:t xml:space="preserve">4.4</w:t>
             </w:r>
           </w:p>
         </w:tc>
@@ -12322,7 +12594,7 @@
           <w:p>
             <w:pPr/>
             <w:r>
-              <w:t xml:space="preserve">Séance arrive sur l'Apple TV, et ton iPhone la met en route avec un simple code.</w:t>
+              <w:t xml:space="preserve">L'Apple TV refaite : une grande image d'accueil, des réglages enfin lisibles, et les écrans de l'iPhone.</w:t>
             </w:r>
           </w:p>
         </w:tc>
@@ -12335,7 +12607,7 @@
           <w:p>
             <w:pPr/>
             <w:r>
-              <w:t xml:space="preserve">3.2.1</w:t>
+              <w:t xml:space="preserve">4.3</w:t>
             </w:r>
           </w:p>
         </w:tc>
@@ -12346,7 +12618,7 @@
           <w:p>
             <w:pPr/>
             <w:r>
-              <w:t xml:space="preserve">19 septembre 2026</w:t>
+              <w:t xml:space="preserve">20 septembre 2026</w:t>
             </w:r>
           </w:p>
         </w:tc>
@@ -12357,7 +12629,7 @@
           <w:p>
             <w:pPr/>
             <w:r>
-              <w:t xml:space="preserve">Sur l'iPad, la barre latérale s'ouvre aussi quand tu tournes la tablette.</w:t>
+              <w:t xml:space="preserve">Où regarder chaque titre d'un coup d'œil, tes vidéos personnelles sur le NAS, et une app d'un seul style.</w:t>
             </w:r>
           </w:p>
         </w:tc>
@@ -12370,7 +12642,7 @@
           <w:p>
             <w:pPr/>
             <w:r>
-              <w:t xml:space="preserve">3.2</w:t>
+              <w:t xml:space="preserve">4.2</w:t>
             </w:r>
           </w:p>
         </w:tc>
@@ -12381,7 +12653,7 @@
           <w:p>
             <w:pPr/>
             <w:r>
-              <w:t xml:space="preserve">19 septembre 2026</w:t>
+              <w:t xml:space="preserve">20 septembre 2026</w:t>
             </w:r>
           </w:p>
         </w:tc>
@@ -12392,7 +12664,7 @@
           <w:p>
             <w:pPr/>
             <w:r>
-              <w:t xml:space="preserve">Des pages vides qui expliquent et proposent, des boutons plus faciles à toucher, et un programme télé juste au petit matin.</w:t>
+              <w:t xml:space="preserve">Un nouvel iPad ou un Mac se configure comme l'Apple TV, par un code ; et ta soirée s'affiche sur l'écran d'accueil de la TV.</w:t>
             </w:r>
           </w:p>
         </w:tc>
@@ -12405,7 +12677,7 @@
           <w:p>
             <w:pPr/>
             <w:r>
-              <w:t xml:space="preserve">3.1.1</w:t>
+              <w:t xml:space="preserve">4.1</w:t>
             </w:r>
           </w:p>
         </w:tc>
@@ -12416,7 +12688,7 @@
           <w:p>
             <w:pPr/>
             <w:r>
-              <w:t xml:space="preserve">18 septembre 2026</w:t>
+              <w:t xml:space="preserve">20 septembre 2026</w:t>
             </w:r>
           </w:p>
         </w:tc>
@@ -12427,7 +12699,7 @@
           <w:p>
             <w:pPr/>
             <w:r>
-              <w:t xml:space="preserve">Sur l'iPad, la barre latérale ne recouvre plus l'accueil.</w:t>
+              <w:t xml:space="preserve">Des Réglages refaits, un seul lecteur pour « Lire », et une Apple TV presque aussi complète que l'iPhone.</w:t>
             </w:r>
           </w:p>
         </w:tc>
@@ -12440,7 +12712,7 @@
           <w:p>
             <w:pPr/>
             <w:r>
-              <w:t xml:space="preserve">3.1</w:t>
+              <w:t xml:space="preserve">4.0</w:t>
             </w:r>
           </w:p>
         </w:tc>
@@ -12451,7 +12723,7 @@
           <w:p>
             <w:pPr/>
             <w:r>
-              <w:t xml:space="preserve">18 septembre 2026</w:t>
+              <w:t xml:space="preserve">20 septembre 2026</w:t>
             </w:r>
           </w:p>
         </w:tc>
@@ -12462,7 +12734,7 @@
           <w:p>
             <w:pPr/>
             <w:r>
-              <w:t xml:space="preserve">Un nouvel appareil prêt en trois étapes, des alertes à bouton, et les derniers écrans alignés.</w:t>
+              <w:t xml:space="preserve">Séance arrive sur l'Apple TV, et ton iPhone la met en route avec un simple code.</w:t>
             </w:r>
           </w:p>
         </w:tc>
@@ -12475,7 +12747,7 @@
           <w:p>
             <w:pPr/>
             <w:r>
-              <w:t xml:space="preserve">3.0</w:t>
+              <w:t xml:space="preserve">3.2.1</w:t>
             </w:r>
           </w:p>
         </w:tc>
@@ -12486,7 +12758,7 @@
           <w:p>
             <w:pPr/>
             <w:r>
-              <w:t xml:space="preserve">18 septembre 2026</w:t>
+              <w:t xml:space="preserve">19 septembre 2026</w:t>
             </w:r>
           </w:p>
         </w:tc>
@@ -12497,7 +12769,7 @@
           <w:p>
             <w:pPr/>
             <w:r>
-              <w:t xml:space="preserve">Une synchronisation qui propage aussi les suppressions, l'app utilisable sans réseau, et trois attentions du quotidien.</w:t>
+              <w:t xml:space="preserve">Sur l'iPad, la barre latérale s'ouvre aussi quand tu tournes la tablette.</w:t>
             </w:r>
           </w:p>
         </w:tc>
@@ -12510,7 +12782,7 @@
           <w:p>
             <w:pPr/>
             <w:r>
-              <w:t xml:space="preserve">2.9</w:t>
+              <w:t xml:space="preserve">3.2</w:t>
             </w:r>
           </w:p>
         </w:tc>
@@ -12521,7 +12793,7 @@
           <w:p>
             <w:pPr/>
             <w:r>
-              <w:t xml:space="preserve">18 septembre 2026</w:t>
+              <w:t xml:space="preserve">19 septembre 2026</w:t>
             </w:r>
           </w:p>
         </w:tc>
@@ -12532,7 +12804,7 @@
           <w:p>
             <w:pPr/>
             <w:r>
-              <w:t xml:space="preserve">Un Profil en images, des Réglages en tableau de bord, et l'apparence claire ou sombre au choix.</w:t>
+              <w:t xml:space="preserve">Des pages vides qui expliquent et proposent, des boutons plus faciles à toucher, et un programme télé juste au petit matin.</w:t>
             </w:r>
           </w:p>
         </w:tc>
@@ -12545,7 +12817,7 @@
           <w:p>
             <w:pPr/>
             <w:r>
-              <w:t xml:space="preserve">2.8</w:t>
+              <w:t xml:space="preserve">3.1.1</w:t>
             </w:r>
           </w:p>
         </w:tc>
@@ -12567,7 +12839,7 @@
           <w:p>
             <w:pPr/>
             <w:r>
-              <w:t xml:space="preserve">Tes appareils se tiennent à jour par un dossier d'iCloud Drive, et une sauvegarde s'envoie par AirDrop.</w:t>
+              <w:t xml:space="preserve">Sur l'iPad, la barre latérale ne recouvre plus l'accueil.</w:t>
             </w:r>
           </w:p>
         </w:tc>
@@ -12580,7 +12852,7 @@
           <w:p>
             <w:pPr/>
             <w:r>
-              <w:t xml:space="preserve">2.7</w:t>
+              <w:t xml:space="preserve">3.1</w:t>
             </w:r>
           </w:p>
         </w:tc>
@@ -12602,7 +12874,7 @@
           <w:p>
             <w:pPr/>
             <w:r>
-              <w:t xml:space="preserve">Une sauvegarde enfin complète pour passer d'un appareil à l'autre, et Siri qui comprend mieux.</w:t>
+              <w:t xml:space="preserve">Un nouvel appareil prêt en trois étapes, des alertes à bouton, et les derniers écrans alignés.</w:t>
             </w:r>
           </w:p>
         </w:tc>
@@ -12615,7 +12887,7 @@
           <w:p>
             <w:pPr/>
             <w:r>
-              <w:t xml:space="preserve">2.6</w:t>
+              <w:t xml:space="preserve">3.0</w:t>
             </w:r>
           </w:p>
         </w:tc>
@@ -12637,7 +12909,7 @@
           <w:p>
             <w:pPr/>
             <w:r>
-              <w:t xml:space="preserve">« À venir » en rangée de jours, Mes listes en affiches, un NAS plus parlant, et l'app entièrement testée sur l'iPhone et l'iPad mini.</w:t>
+              <w:t xml:space="preserve">Une synchronisation qui propage aussi les suppressions, l'app utilisable sans réseau, et trois attentions du quotidien.</w:t>
             </w:r>
           </w:p>
         </w:tc>
@@ -12650,7 +12922,7 @@
           <w:p>
             <w:pPr/>
             <w:r>
-              <w:t xml:space="preserve">2.5</w:t>
+              <w:t xml:space="preserve">2.9</w:t>
             </w:r>
           </w:p>
         </w:tc>
@@ -12672,7 +12944,7 @@
           <w:p>
             <w:pPr/>
             <w:r>
-              <w:t xml:space="preserve">Réglages ne fige plus l'iPhone ; programme télé et Ce soir refaits en grandes cartes ; source des idées, accueil à ta mesure et ton prénom.</w:t>
+              <w:t xml:space="preserve">Un Profil en images, des Réglages en tableau de bord, et l'apparence claire ou sombre au choix.</w:t>
             </w:r>
           </w:p>
         </w:tc>
@@ -12685,7 +12957,7 @@
           <w:p>
             <w:pPr/>
             <w:r>
-              <w:t xml:space="preserve">2.4</w:t>
+              <w:t xml:space="preserve">2.8</w:t>
             </w:r>
           </w:p>
         </w:tc>
@@ -12707,7 +12979,7 @@
           <w:p>
             <w:pPr/>
             <w:r>
-              <w:t xml:space="preserve">Prévoir et ranger depuis partout, listes nommées, où regarder sur les affiches, et des données versionnées.</w:t>
+              <w:t xml:space="preserve">Tes appareils se tiennent à jour par un dossier d'iCloud Drive, et une sauvegarde s'envoie par AirDrop.</w:t>
             </w:r>
           </w:p>
         </w:tc>
@@ -12720,7 +12992,7 @@
           <w:p>
             <w:pPr/>
             <w:r>
-              <w:t xml:space="preserve">2.3</w:t>
+              <w:t xml:space="preserve">2.7</w:t>
             </w:r>
           </w:p>
         </w:tc>
@@ -12742,7 +13014,7 @@
           <w:p>
             <w:pPr/>
             <w:r>
-              <w:t xml:space="preserve">Prévoir un film ou une série pour la soirée de ton choix.</w:t>
+              <w:t xml:space="preserve">Une sauvegarde enfin complète pour passer d'un appareil à l'autre, et Siri qui comprend mieux.</w:t>
             </w:r>
           </w:p>
         </w:tc>
@@ -12755,7 +13027,7 @@
           <w:p>
             <w:pPr/>
             <w:r>
-              <w:t xml:space="preserve">2.2</w:t>
+              <w:t xml:space="preserve">2.6</w:t>
             </w:r>
           </w:p>
         </w:tc>
@@ -12777,7 +13049,7 @@
           <w:p>
             <w:pPr/>
             <w:r>
-              <w:t xml:space="preserve">Ce soir, en plus simple : seulement ce que tu as choisi de regarder.</w:t>
+              <w:t xml:space="preserve">« À venir » en rangée de jours, Mes listes en affiches, un NAS plus parlant, et l'app entièrement testée sur l'iPhone et l'iPad mini.</w:t>
             </w:r>
           </w:p>
         </w:tc>
@@ -12790,7 +13062,7 @@
           <w:p>
             <w:pPr/>
             <w:r>
-              <w:t xml:space="preserve">2.1</w:t>
+              <w:t xml:space="preserve">2.5</w:t>
             </w:r>
           </w:p>
         </w:tc>
@@ -12801,7 +13073,7 @@
           <w:p>
             <w:pPr/>
             <w:r>
-              <w:t xml:space="preserve">17 septembre 2026</w:t>
+              <w:t xml:space="preserve">18 septembre 2026</w:t>
             </w:r>
           </w:p>
         </w:tc>
@@ -12812,7 +13084,7 @@
           <w:p>
             <w:pPr/>
             <w:r>
-              <w:t xml:space="preserve">Le parcours d'un utilisateur, corrigé point par point : idées qui se renouvellent, fiches de séries justes, écrans plus nets.</w:t>
+              <w:t xml:space="preserve">Réglages ne fige plus l'iPhone ; programme télé et Ce soir refaits en grandes cartes ; source des idées, accueil à ta mesure et ton prénom.</w:t>
             </w:r>
           </w:p>
         </w:tc>
@@ -12825,7 +13097,7 @@
           <w:p>
             <w:pPr/>
             <w:r>
-              <w:t xml:space="preserve">2.0</w:t>
+              <w:t xml:space="preserve">2.4</w:t>
             </w:r>
           </w:p>
         </w:tc>
@@ -12836,7 +13108,7 @@
           <w:p>
             <w:pPr/>
             <w:r>
-              <w:t xml:space="preserve">17 septembre 2026</w:t>
+              <w:t xml:space="preserve">18 septembre 2026</w:t>
             </w:r>
           </w:p>
         </w:tc>
@@ -12847,7 +13119,7 @@
           <w:p>
             <w:pPr/>
             <w:r>
-              <w:t xml:space="preserve">Des idées pour ce soir selon tes goûts, une app plus claire et qui prévient quand quelque chose cloche.</w:t>
+              <w:t xml:space="preserve">Prévoir et ranger depuis partout, listes nommées, où regarder sur les affiches, et des données versionnées.</w:t>
             </w:r>
           </w:p>
         </w:tc>
@@ -12860,7 +13132,7 @@
           <w:p>
             <w:pPr/>
             <w:r>
-              <w:t xml:space="preserve">1.5</w:t>
+              <w:t xml:space="preserve">2.3</w:t>
             </w:r>
           </w:p>
         </w:tc>
@@ -12871,7 +13143,7 @@
           <w:p>
             <w:pPr/>
             <w:r>
-              <w:t xml:space="preserve">17 septembre 2026</w:t>
+              <w:t xml:space="preserve">18 septembre 2026</w:t>
             </w:r>
           </w:p>
         </w:tc>
@@ -12882,7 +13154,7 @@
           <w:p>
             <w:pPr/>
             <w:r>
-              <w:t xml:space="preserve">« Du moment » sur l'accueil, et les terminés se suppriment de Mes listes.</w:t>
+              <w:t xml:space="preserve">Prévoir un film ou une série pour la soirée de ton choix.</w:t>
             </w:r>
           </w:p>
         </w:tc>
@@ -12895,7 +13167,7 @@
           <w:p>
             <w:pPr/>
             <w:r>
-              <w:t xml:space="preserve">1.4</w:t>
+              <w:t xml:space="preserve">2.2</w:t>
             </w:r>
           </w:p>
         </w:tc>
@@ -12906,7 +13178,7 @@
           <w:p>
             <w:pPr/>
             <w:r>
-              <w:t xml:space="preserve">17 septembre 2026</w:t>
+              <w:t xml:space="preserve">18 septembre 2026</w:t>
             </w:r>
           </w:p>
         </w:tc>
@@ -12917,7 +13189,7 @@
           <w:p>
             <w:pPr/>
             <w:r>
-              <w:t xml:space="preserve">Top 10 de l'année, Regardable ce soir dans Mes listes, actions rapides sur les affiches, menu masquable sur le Mac.</w:t>
+              <w:t xml:space="preserve">Ce soir, en plus simple : seulement ce que tu as choisi de regarder.</w:t>
             </w:r>
           </w:p>
         </w:tc>
@@ -12930,7 +13202,7 @@
           <w:p>
             <w:pPr/>
             <w:r>
-              <w:t xml:space="preserve">1.3</w:t>
+              <w:t xml:space="preserve">2.1</w:t>
             </w:r>
           </w:p>
         </w:tc>
@@ -12952,7 +13224,7 @@
           <w:p>
             <w:pPr/>
             <w:r>
-              <w:t xml:space="preserve">Acteurs : recherche, suivi, statistiques justes ; titres similaires et note dans l'en-tête.</w:t>
+              <w:t xml:space="preserve">Le parcours d'un utilisateur, corrigé point par point : idées qui se renouvellent, fiches de séries justes, écrans plus nets.</w:t>
             </w:r>
           </w:p>
         </w:tc>
@@ -12965,7 +13237,7 @@
           <w:p>
             <w:pPr/>
             <w:r>
-              <w:t xml:space="preserve">1.2</w:t>
+              <w:t xml:space="preserve">2.0</w:t>
             </w:r>
           </w:p>
         </w:tc>
@@ -12987,7 +13259,7 @@
           <w:p>
             <w:pPr/>
             <w:r>
-              <w:t xml:space="preserve">Statistiques et bilan de l'année, widgets, Siri, fiche acteur, premier lancement guidé et vraie mise en page Mac.</w:t>
+              <w:t xml:space="preserve">Des idées pour ce soir selon tes goûts, une app plus claire et qui prévient quand quelque chose cloche.</w:t>
             </w:r>
           </w:p>
         </w:tc>
@@ -13000,7 +13272,7 @@
           <w:p>
             <w:pPr/>
             <w:r>
-              <w:t xml:space="preserve">1.1</w:t>
+              <w:t xml:space="preserve">1.5</w:t>
             </w:r>
           </w:p>
         </w:tc>
@@ -13022,7 +13294,7 @@
           <w:p>
             <w:pPr/>
             <w:r>
-              <w:t xml:space="preserve">Suivi des séries, alertes complètes et version Mac.</w:t>
+              <w:t xml:space="preserve">« Du moment » sur l'accueil, et les terminés se suppriment de Mes listes.</w:t>
             </w:r>
           </w:p>
         </w:tc>
@@ -13035,7 +13307,7 @@
           <w:p>
             <w:pPr/>
             <w:r>
-              <w:t xml:space="preserve">1.0</w:t>
+              <w:t xml:space="preserve">1.4</w:t>
             </w:r>
           </w:p>
         </w:tc>
@@ -13046,7 +13318,7 @@
           <w:p>
             <w:pPr/>
             <w:r>
-              <w:t xml:space="preserve">16 septembre 2026</w:t>
+              <w:t xml:space="preserve">17 septembre 2026</w:t>
             </w:r>
           </w:p>
         </w:tc>
@@ -13057,7 +13329,7 @@
           <w:p>
             <w:pPr/>
             <w:r>
-              <w:t xml:space="preserve">Première version stable : NAS, Explorer et fiches fiabilisés à l'usage sur l'iPhone.</w:t>
+              <w:t xml:space="preserve">Top 10 de l'année, Regardable ce soir dans Mes listes, actions rapides sur les affiches, menu masquable sur le Mac.</w:t>
             </w:r>
           </w:p>
         </w:tc>
@@ -13070,6 +13342,146 @@
           <w:p>
             <w:pPr/>
             <w:r>
+              <w:t xml:space="preserve">1.3</w:t>
+            </w:r>
+          </w:p>
+        </w:tc>
+        <w:tc>
+          <w:tcPr>
+            <w:tcW w:w="2300" w:type="dxa"/>
+          </w:tcPr>
+          <w:p>
+            <w:pPr/>
+            <w:r>
+              <w:t xml:space="preserve">17 septembre 2026</w:t>
+            </w:r>
+          </w:p>
+        </w:tc>
+        <w:tc>
+          <w:tcPr>
+            <w:tcW w:w="5960" w:type="dxa"/>
+          </w:tcPr>
+          <w:p>
+            <w:pPr/>
+            <w:r>
+              <w:t xml:space="preserve">Acteurs : recherche, suivi, statistiques justes ; titres similaires et note dans l'en-tête.</w:t>
+            </w:r>
+          </w:p>
+        </w:tc>
+      </w:tr>
+      <w:tr>
+        <w:tc>
+          <w:tcPr>
+            <w:tcW w:w="1100" w:type="dxa"/>
+          </w:tcPr>
+          <w:p>
+            <w:pPr/>
+            <w:r>
+              <w:t xml:space="preserve">1.2</w:t>
+            </w:r>
+          </w:p>
+        </w:tc>
+        <w:tc>
+          <w:tcPr>
+            <w:tcW w:w="2300" w:type="dxa"/>
+          </w:tcPr>
+          <w:p>
+            <w:pPr/>
+            <w:r>
+              <w:t xml:space="preserve">17 septembre 2026</w:t>
+            </w:r>
+          </w:p>
+        </w:tc>
+        <w:tc>
+          <w:tcPr>
+            <w:tcW w:w="5960" w:type="dxa"/>
+          </w:tcPr>
+          <w:p>
+            <w:pPr/>
+            <w:r>
+              <w:t xml:space="preserve">Statistiques et bilan de l'année, widgets, Siri, fiche acteur, premier lancement guidé et vraie mise en page Mac.</w:t>
+            </w:r>
+          </w:p>
+        </w:tc>
+      </w:tr>
+      <w:tr>
+        <w:tc>
+          <w:tcPr>
+            <w:tcW w:w="1100" w:type="dxa"/>
+          </w:tcPr>
+          <w:p>
+            <w:pPr/>
+            <w:r>
+              <w:t xml:space="preserve">1.1</w:t>
+            </w:r>
+          </w:p>
+        </w:tc>
+        <w:tc>
+          <w:tcPr>
+            <w:tcW w:w="2300" w:type="dxa"/>
+          </w:tcPr>
+          <w:p>
+            <w:pPr/>
+            <w:r>
+              <w:t xml:space="preserve">17 septembre 2026</w:t>
+            </w:r>
+          </w:p>
+        </w:tc>
+        <w:tc>
+          <w:tcPr>
+            <w:tcW w:w="5960" w:type="dxa"/>
+          </w:tcPr>
+          <w:p>
+            <w:pPr/>
+            <w:r>
+              <w:t xml:space="preserve">Suivi des séries, alertes complètes et version Mac.</w:t>
+            </w:r>
+          </w:p>
+        </w:tc>
+      </w:tr>
+      <w:tr>
+        <w:tc>
+          <w:tcPr>
+            <w:tcW w:w="1100" w:type="dxa"/>
+          </w:tcPr>
+          <w:p>
+            <w:pPr/>
+            <w:r>
+              <w:t xml:space="preserve">1.0</w:t>
+            </w:r>
+          </w:p>
+        </w:tc>
+        <w:tc>
+          <w:tcPr>
+            <w:tcW w:w="2300" w:type="dxa"/>
+          </w:tcPr>
+          <w:p>
+            <w:pPr/>
+            <w:r>
+              <w:t xml:space="preserve">16 septembre 2026</w:t>
+            </w:r>
+          </w:p>
+        </w:tc>
+        <w:tc>
+          <w:tcPr>
+            <w:tcW w:w="5960" w:type="dxa"/>
+          </w:tcPr>
+          <w:p>
+            <w:pPr/>
+            <w:r>
+              <w:t xml:space="preserve">Première version stable : NAS, Explorer et fiches fiabilisés à l'usage sur l'iPhone.</w:t>
+            </w:r>
+          </w:p>
+        </w:tc>
+      </w:tr>
+      <w:tr>
+        <w:tc>
+          <w:tcPr>
+            <w:tcW w:w="1100" w:type="dxa"/>
+          </w:tcPr>
+          <w:p>
+            <w:pPr/>
+            <w:r>
               <w:t xml:space="preserve">0.9</w:t>
             </w:r>
           </w:p>
@@ -13462,7 +13874,7 @@
     <w:p>
       <w:pPr/>
       <w:r>
-        <w:t xml:space="preserve">Ce qui reste ouvert après la version 4.6 (20 septembre 2026).</w:t>
+        <w:t xml:space="preserve">Ce qui reste ouvert après la version 5.2 (21 septembre 2026).</w:t>
       </w:r>
     </w:p>
     <w:p>
@@ -13546,7 +13958,7 @@
         <w:t xml:space="preserve">Prochain lot</w:t>
       </w:r>
       <w:r>
-        <w:t xml:space="preserve"> : documentaires (EF-151 à EF-156), favoris (EF-165 à EF-168) ou envoi d'une vidéo vers le NAS (EF-161) — à choisir.</w:t>
+        <w:t xml:space="preserve"> : envoi d'une vidéo vers le NAS (EF-161), fichier de favoris à ouvrir chez un ami (EF-167), documentaires à la télé et sur le NAS, ou l'une des idées laissées de côté le 21 septembre — notifications actionnables, raccourcis clavier sur l'iPad et le Mac, choix « j'ai 90 minutes » au-dessus des idées.</w:t>
       </w:r>
     </w:p>
     <w:p>

</xml_diff>